<commit_message>
site: OfficeApp @ 06ed9c7a for writer.starling.build
</commit_message>
<xml_diff>
--- a/examples/garden-brief.docx
+++ b/examples/garden-brief.docx
@@ -2,15 +2,6 @@
 <file path=word/document.xml><?xml version="1.0" encoding="utf-8"?>
 <w:document xmlns:wpc="http://schemas.microsoft.com/office/word/2010/wordprocessingCanvas" xmlns:mo="http://schemas.microsoft.com/office/mac/office/2008/main" xmlns:mc="http://schemas.openxmlformats.org/markup-compatibility/2006" xmlns:mv="urn:schemas-microsoft-com:mac:vml" xmlns:o="urn:schemas-microsoft-com:office:office" xmlns:r="http://schemas.openxmlformats.org/officeDocument/2006/relationships" xmlns:m="http://schemas.openxmlformats.org/officeDocument/2006/math" xmlns:v="urn:schemas-microsoft-com:vml" xmlns:wp14="http://schemas.microsoft.com/office/word/2010/wordprocessingDrawing" xmlns:wp="http://schemas.openxmlformats.org/drawingml/2006/wordprocessingDrawing" xmlns:w10="urn:schemas-microsoft-com:office:word" xmlns:w="http://schemas.openxmlformats.org/wordprocessingml/2006/main" xmlns:w14="http://schemas.microsoft.com/office/word/2010/wordml" xmlns:wpg="http://schemas.microsoft.com/office/word/2010/wordprocessingGroup" xmlns:wpi="http://schemas.microsoft.com/office/word/2010/wordprocessingInk" xmlns:wne="http://schemas.microsoft.com/office/word/2006/wordml" xmlns:wps="http://schemas.microsoft.com/office/word/2010/wordprocessingShape" mc:Ignorable="w14 wp14">
   <w:body>
-    <w:p>
-      <w:r>
-        <w:rPr>
-          <w:b/>
-          <w:sz w:val="20"/>
-        </w:rPr>
-        <w:t>FIELD NOTES  /  PROJECT BRIEF</w:t>
-      </w:r>
-    </w:p>
     <w:p>
       <w:pPr>
         <w:pStyle w:val="Title"/>
@@ -29,7 +20,46 @@
     </w:p>
     <w:p>
       <w:r>
-        <w:t>Turn an unused corner into a shared place to plant, learn, and spend time outdoors. This brief brings the first steps, the people, and the plan onto one page.</w:t>
+        <w:drawing>
+          <wp:inline xmlns:a="http://schemas.openxmlformats.org/drawingml/2006/main" xmlns:pic="http://schemas.openxmlformats.org/drawingml/2006/picture">
+            <wp:extent cx="6400800" cy="2240280"/>
+            <wp:docPr id="1" name="Picture 1"/>
+            <wp:cNvGraphicFramePr>
+              <a:graphicFrameLocks noChangeAspect="1"/>
+            </wp:cNvGraphicFramePr>
+            <a:graphic>
+              <a:graphicData uri="http://schemas.openxmlformats.org/drawingml/2006/picture">
+                <pic:pic>
+                  <pic:nvPicPr>
+                    <pic:cNvPr id="0" name="image.png"/>
+                    <pic:cNvPicPr/>
+                  </pic:nvPicPr>
+                  <pic:blipFill>
+                    <a:blip r:embed="rId11"/>
+                    <a:stretch>
+                      <a:fillRect/>
+                    </a:stretch>
+                  </pic:blipFill>
+                  <pic:spPr>
+                    <a:xfrm>
+                      <a:off x="0" y="0"/>
+                      <a:ext cx="6400800" cy="2240280"/>
+                    </a:xfrm>
+                    <a:prstGeom prst="rect"/>
+                  </pic:spPr>
+                </pic:pic>
+              </a:graphicData>
+            </a:graphic>
+          </wp:inline>
+        </w:drawing>
+      </w:r>
+    </w:p>
+    <w:p>
+      <w:pPr>
+        <w:pStyle w:val="Caption"/>
+      </w:pPr>
+      <w:r>
+        <w:t>Six raised beds, a shared path, and room for everyone.</w:t>
       </w:r>
     </w:p>
     <w:p>
@@ -42,7 +72,16 @@
     </w:p>
     <w:p>
       <w:r>
-        <w:t>Start small: six raised beds, a welcoming path, and a weekly open morning. Make it easy for a first-time gardener to take part.</w:t>
+        <w:t xml:space="preserve">Turn an unused corner into a shared place to </w:t>
+      </w:r>
+      <w:r>
+        <w:rPr>
+          <w:b/>
+        </w:rPr>
+        <w:t>plant, learn, and belong.</w:t>
+      </w:r>
+      <w:r>
+        <w:t xml:space="preserve"> Start with six beds, shared tools, and a weekly open morning.</w:t>
       </w:r>
     </w:p>
     <w:p>
@@ -66,7 +105,7 @@
         </w:numPr>
       </w:pPr>
       <w:r>
-        <w:t>Bring neighbors together through practical workshops.</w:t>
+        <w:t>Make first-time gardeners feel at home.</w:t>
       </w:r>
     </w:p>
     <w:p>
@@ -78,7 +117,39 @@
         </w:numPr>
       </w:pPr>
       <w:r>
-        <w:t>Create a space that gets better with every season.</w:t>
+        <w:t>Build a space that gets better with every season.</w:t>
+      </w:r>
+    </w:p>
+    <w:p>
+      <w:pPr>
+        <w:pStyle w:val="Heading2"/>
+      </w:pPr>
+      <w:r>
+        <w:t>A living plan</w:t>
+      </w:r>
+    </w:p>
+    <w:p>
+      <w:r>
+        <w:t xml:space="preserve">This handbook is a starting point. </w:t>
+      </w:r>
+      <w:r>
+        <w:rPr>
+          <w:i/>
+        </w:rPr>
+        <w:t>Every neighbor can shape what comes next.</w:t>
+      </w:r>
+    </w:p>
+    <w:p>
+      <w:pPr>
+        <w:pStyle w:val="Quote"/>
+      </w:pPr>
+      <w:r>
+        <w:t>Try it: change a heading style, resize the picture, or add a bullet. Use the navigation pane to jump between headings.</w:t>
+      </w:r>
+    </w:p>
+    <w:p>
+      <w:r>
+        <w:br w:type="page"/>
       </w:r>
     </w:p>
     <w:p>
@@ -89,6 +160,11 @@
         <w:t>From a sketch to a shared space</w:t>
       </w:r>
     </w:p>
+    <w:p>
+      <w:r>
+        <w:t>Four weeks to opening day. Keep the plan practical, visible, and easy to change.</w:t>
+      </w:r>
+    </w:p>
     <w:tbl>
       <w:tblPr>
         <w:tblStyle w:val="LightShading-Accent1"/>
@@ -97,14 +173,15 @@
         <w:tblLook w:firstColumn="1" w:firstRow="1" w:lastColumn="0" w:lastRow="0" w:noHBand="0" w:noVBand="1" w:val="04A0"/>
       </w:tblPr>
       <w:tblGrid>
+        <w:gridCol w:w="1152"/>
+        <w:gridCol w:w="4464"/>
+        <w:gridCol w:w="2304"/>
         <w:gridCol w:w="1584"/>
-        <w:gridCol w:w="4752"/>
-        <w:gridCol w:w="2304"/>
       </w:tblGrid>
       <w:tr>
         <w:tc>
           <w:tcPr>
-            <w:tcW w:type="dxa" w:w="1584"/>
+            <w:tcW w:type="dxa" w:w="1152"/>
           </w:tcPr>
           <w:p>
             <w:r>
@@ -114,7 +191,7 @@
         </w:tc>
         <w:tc>
           <w:tcPr>
-            <w:tcW w:type="dxa" w:w="4752"/>
+            <w:tcW w:type="dxa" w:w="4464"/>
           </w:tcPr>
           <w:p>
             <w:r>
@@ -128,6 +205,16 @@
           </w:tcPr>
           <w:p>
             <w:r>
+              <w:t>Owner</w:t>
+            </w:r>
+          </w:p>
+        </w:tc>
+        <w:tc>
+          <w:tcPr>
+            <w:tcW w:type="dxa" w:w="1584"/>
+          </w:tcPr>
+          <w:p>
+            <w:r>
               <w:t>Timing</w:t>
             </w:r>
           </w:p>
@@ -136,7 +223,7 @@
       <w:tr>
         <w:tc>
           <w:tcPr>
-            <w:tcW w:type="dxa" w:w="1584"/>
+            <w:tcW w:type="dxa" w:w="1152"/>
           </w:tcPr>
           <w:p>
             <w:r>
@@ -146,17 +233,27 @@
         </w:tc>
         <w:tc>
           <w:tcPr>
-            <w:tcW w:type="dxa" w:w="4752"/>
+            <w:tcW w:type="dxa" w:w="4464"/>
           </w:tcPr>
           <w:p>
             <w:r>
-              <w:t>Meet neighbors and gather ideas</w:t>
+              <w:t>Meet neighbors; gather ideas</w:t>
             </w:r>
           </w:p>
         </w:tc>
         <w:tc>
           <w:tcPr>
             <w:tcW w:type="dxa" w:w="2304"/>
+          </w:tcPr>
+          <w:p>
+            <w:r>
+              <w:t>Community team</w:t>
+            </w:r>
+          </w:p>
+        </w:tc>
+        <w:tc>
+          <w:tcPr>
+            <w:tcW w:type="dxa" w:w="1584"/>
           </w:tcPr>
           <w:p>
             <w:r>
@@ -168,7 +265,7 @@
       <w:tr>
         <w:tc>
           <w:tcPr>
-            <w:tcW w:type="dxa" w:w="1584"/>
+            <w:tcW w:type="dxa" w:w="1152"/>
           </w:tcPr>
           <w:p>
             <w:r>
@@ -178,7 +275,7 @@
         </w:tc>
         <w:tc>
           <w:tcPr>
-            <w:tcW w:type="dxa" w:w="4752"/>
+            <w:tcW w:type="dxa" w:w="4464"/>
           </w:tcPr>
           <w:p>
             <w:r>
@@ -192,7 +289,17 @@
           </w:tcPr>
           <w:p>
             <w:r>
-              <w:t>Weeks 2–3</w:t>
+              <w:t>Build team</w:t>
+            </w:r>
+          </w:p>
+        </w:tc>
+        <w:tc>
+          <w:tcPr>
+            <w:tcW w:type="dxa" w:w="1584"/>
+          </w:tcPr>
+          <w:p>
+            <w:r>
+              <w:t>Week 2</w:t>
             </w:r>
           </w:p>
         </w:tc>
@@ -200,27 +307,79 @@
       <w:tr>
         <w:tc>
           <w:tcPr>
-            <w:tcW w:type="dxa" w:w="1584"/>
+            <w:tcW w:type="dxa" w:w="1152"/>
           </w:tcPr>
           <w:p>
             <w:r>
-              <w:t>Grow</w:t>
+              <w:t>Plant</w:t>
             </w:r>
           </w:p>
         </w:tc>
         <w:tc>
           <w:tcPr>
-            <w:tcW w:type="dxa" w:w="4752"/>
+            <w:tcW w:type="dxa" w:w="4464"/>
           </w:tcPr>
           <w:p>
             <w:r>
-              <w:t>Plant together and open the gates</w:t>
+              <w:t>Sow seeds and label each bed</w:t>
             </w:r>
           </w:p>
         </w:tc>
         <w:tc>
           <w:tcPr>
             <w:tcW w:type="dxa" w:w="2304"/>
+          </w:tcPr>
+          <w:p>
+            <w:r>
+              <w:t>Garden team</w:t>
+            </w:r>
+          </w:p>
+        </w:tc>
+        <w:tc>
+          <w:tcPr>
+            <w:tcW w:type="dxa" w:w="1584"/>
+          </w:tcPr>
+          <w:p>
+            <w:r>
+              <w:t>Week 3</w:t>
+            </w:r>
+          </w:p>
+        </w:tc>
+      </w:tr>
+      <w:tr>
+        <w:tc>
+          <w:tcPr>
+            <w:tcW w:type="dxa" w:w="1152"/>
+          </w:tcPr>
+          <w:p>
+            <w:r>
+              <w:t>Open</w:t>
+            </w:r>
+          </w:p>
+        </w:tc>
+        <w:tc>
+          <w:tcPr>
+            <w:tcW w:type="dxa" w:w="4464"/>
+          </w:tcPr>
+          <w:p>
+            <w:r>
+              <w:t>Welcome everyone; share the plan</w:t>
+            </w:r>
+          </w:p>
+        </w:tc>
+        <w:tc>
+          <w:tcPr>
+            <w:tcW w:type="dxa" w:w="2304"/>
+          </w:tcPr>
+          <w:p>
+            <w:r>
+              <w:t>All volunteers</w:t>
+            </w:r>
+          </w:p>
+        </w:tc>
+        <w:tc>
+          <w:tcPr>
+            <w:tcW w:type="dxa" w:w="1584"/>
           </w:tcPr>
           <w:p>
             <w:r>
@@ -232,20 +391,322 @@
     </w:tbl>
     <w:p>
       <w:pPr>
+        <w:pStyle w:val="Heading2"/>
+      </w:pPr>
+      <w:r>
+        <w:t>Opening morning</w:t>
+      </w:r>
+    </w:p>
+    <w:p>
+      <w:pPr>
+        <w:pStyle w:val="ListNumber"/>
+        <w:numPr>
+          <w:ilvl w:val="0"/>
+          <w:numId w:val="5"/>
+        </w:numPr>
+      </w:pPr>
+      <w:r>
+        <w:t>Walk the site together and explain the shared tools.</w:t>
+      </w:r>
+    </w:p>
+    <w:p>
+      <w:pPr>
+        <w:pStyle w:val="ListNumber"/>
+        <w:numPr>
+          <w:ilvl w:val="0"/>
+          <w:numId w:val="5"/>
+        </w:numPr>
+      </w:pPr>
+      <w:r>
+        <w:t>Plant the first seedlings and record what goes where.</w:t>
+      </w:r>
+    </w:p>
+    <w:p>
+      <w:pPr>
+        <w:pStyle w:val="ListNumber"/>
+        <w:numPr>
+          <w:ilvl w:val="0"/>
+          <w:numId w:val="5"/>
+        </w:numPr>
+      </w:pPr>
+      <w:r>
+        <w:t>Agree on the next watering shift before everyone leaves.</w:t>
+      </w:r>
+    </w:p>
+    <w:p>
+      <w:pPr>
+        <w:pStyle w:val="Heading2"/>
+      </w:pPr>
+      <w:r>
+        <w:t>Everyone has a part</w:t>
+      </w:r>
+    </w:p>
+    <w:p>
+      <w:r>
+        <w:t xml:space="preserve">Bring gloves, a water bottle, and a neighbor. </w:t>
+      </w:r>
+      <w:r>
+        <w:rPr>
+          <w:b/>
+        </w:rPr>
+        <w:t>No experience needed.</w:t>
+      </w:r>
+    </w:p>
+    <w:p>
+      <w:r>
+        <w:t xml:space="preserve">Related tools: </w:t>
+      </w:r>
+      <w:hyperlink r:id="rId12">
+        <w:r>
+          <w:rPr>
+            <w:color w:val="2449DF"/>
+            <w:u w:val="single"/>
+          </w:rPr>
+          <w:t>open the garden budget in Sheets</w:t>
+        </w:r>
+      </w:hyperlink>
+    </w:p>
+    <w:p>
+      <w:pPr>
         <w:pStyle w:val="Quote"/>
       </w:pPr>
       <w:r>
-        <w:t>Small beginnings. Something worth growing.</w:t>
+        <w:t>Try it: add a schedule row, edit a cell, continue the numbered list, or use Find and Replace to rename a team. Undo restores your last change.</w:t>
+      </w:r>
+    </w:p>
+    <w:p>
+      <w:r>
+        <w:br w:type="page"/>
+      </w:r>
+    </w:p>
+    <w:p>
+      <w:pPr>
+        <w:pStyle w:val="Heading1"/>
+      </w:pPr>
+      <w:r>
+        <w:t>Care for the season ahead</w:t>
+      </w:r>
+    </w:p>
+    <w:p>
+      <w:pPr>
+        <w:pStyle w:val="Heading2"/>
+      </w:pPr>
+      <w:r>
+        <w:t>Water thoughtfully</w:t>
+      </w:r>
+    </w:p>
+    <w:p>
+      <w:r>
+        <w:t>Check the soil before watering. A short check each morning is better than a fixed rule that ignores the weather.</w:t>
+      </w:r>
+    </w:p>
+    <w:p>
+      <w:pPr>
+        <w:pStyle w:val="Heading2"/>
+      </w:pPr>
+      <w:r>
+        <w:t>Keep useful field notes</w:t>
+      </w:r>
+    </w:p>
+    <w:p>
+      <w:r>
+        <w:t xml:space="preserve">Write dates, varieties, and what you notice. Mark a </w:t>
+      </w:r>
+      <w:r>
+        <w:rPr>
+          <w:i/>
+        </w:rPr>
+        <w:t>small experiment</w:t>
+      </w:r>
+      <w:r>
+        <w:t xml:space="preserve"> and compare the result next week.</w:t>
+      </w:r>
+    </w:p>
+    <w:p>
+      <w:r>
+        <w:t>A few details can carry meaning: bed area in m</w:t>
+      </w:r>
+      <w:r>
+        <w:rPr>
+          <w:vertAlign w:val="superscript"/>
+        </w:rPr>
+        <w:t>2</w:t>
+      </w:r>
+      <w:r>
+        <w:t>, water as H</w:t>
+      </w:r>
+      <w:r>
+        <w:rPr>
+          <w:vertAlign w:val="subscript"/>
+        </w:rPr>
+        <w:t>2</w:t>
+      </w:r>
+      <w:r>
+        <w:t xml:space="preserve">O, and </w:t>
+      </w:r>
+      <w:r>
+        <w:rPr>
+          <w:strike/>
+        </w:rPr>
+        <w:t>a revised plan</w:t>
+      </w:r>
+      <w:r>
+        <w:t xml:space="preserve"> a better plan.</w:t>
+      </w:r>
+    </w:p>
+    <w:tbl>
+      <w:tblPr>
+        <w:tblStyle w:val="LightShading-Accent1"/>
+        <w:tblW w:type="auto" w:w="0"/>
+        <w:tblLayout w:type="fixed"/>
+        <w:tblLook w:firstColumn="1" w:firstRow="1" w:lastColumn="0" w:lastRow="0" w:noHBand="0" w:noVBand="1" w:val="04A0"/>
+      </w:tblPr>
+      <w:tblGrid>
+        <w:gridCol w:w="5040"/>
+        <w:gridCol w:w="5040"/>
+      </w:tblGrid>
+      <w:tr>
+        <w:tc>
+          <w:tcPr>
+            <w:tcW w:type="dxa" w:w="10080"/>
+            <w:gridSpan w:val="2"/>
+          </w:tcPr>
+          <w:p>
+            <w:r>
+              <w:t>A shared agreement</w:t>
+            </w:r>
+          </w:p>
+        </w:tc>
+      </w:tr>
+      <w:tr>
+        <w:tc>
+          <w:tcPr>
+            <w:tcW w:type="dxa" w:w="5040"/>
+          </w:tcPr>
+          <w:p>
+            <w:r>
+              <w:t>Share the harvest</w:t>
+            </w:r>
+          </w:p>
+        </w:tc>
+        <w:tc>
+          <w:tcPr>
+            <w:tcW w:type="dxa" w:w="5040"/>
+          </w:tcPr>
+          <w:p>
+            <w:r>
+              <w:t>Leave a portion for neighbors who cannot join the work.</w:t>
+            </w:r>
+          </w:p>
+        </w:tc>
+      </w:tr>
+      <w:tr>
+        <w:tc>
+          <w:tcPr>
+            <w:tcW w:type="dxa" w:w="5040"/>
+          </w:tcPr>
+          <w:p>
+            <w:r>
+              <w:t>Share the tools</w:t>
+            </w:r>
+          </w:p>
+        </w:tc>
+        <w:tc>
+          <w:tcPr>
+            <w:tcW w:type="dxa" w:w="5040"/>
+          </w:tcPr>
+          <w:p>
+            <w:r>
+              <w:t>Clean them, return them, and report anything broken.</w:t>
+            </w:r>
+          </w:p>
+        </w:tc>
+      </w:tr>
+      <w:tr>
+        <w:tc>
+          <w:tcPr>
+            <w:tcW w:type="dxa" w:w="5040"/>
+          </w:tcPr>
+          <w:p>
+            <w:r>
+              <w:t>Share the learning</w:t>
+            </w:r>
+          </w:p>
+        </w:tc>
+        <w:tc>
+          <w:tcPr>
+            <w:tcW w:type="dxa" w:w="5040"/>
+          </w:tcPr>
+          <w:p>
+            <w:r>
+              <w:t>Keep a short note of what worked and what to try next.</w:t>
+            </w:r>
+          </w:p>
+        </w:tc>
+      </w:tr>
+    </w:tbl>
+    <w:p>
+      <w:pPr>
+        <w:pStyle w:val="Quote"/>
+      </w:pPr>
+      <w:r>
+        <w:t>“A garden grows twice: once in the ground, and once between the people who tend it.”</w:t>
+      </w:r>
+    </w:p>
+    <w:p>
+      <w:pPr>
+        <w:pStyle w:val="Heading2"/>
+      </w:pPr>
+      <w:r>
+        <w:t>Make this handbook yours</w:t>
+      </w:r>
+    </w:p>
+    <w:p>
+      <w:r>
+        <w:t>Try the header and footer, page number field, hyperlink, table formatting, text color, and alignment. Save a copy as DOCX, then reopen it to continue.</w:t>
       </w:r>
     </w:p>
     <w:sectPr>
+      <w:headerReference w:type="default" r:id="rId9"/>
+      <w:footerReference w:type="default" r:id="rId10"/>
       <w:pgSz w:w="12240" w:h="15840"/>
-      <w:pgMar w:top="936" w:right="1800" w:bottom="936" w:left="1800" w:header="720" w:footer="720" w:gutter="0"/>
+      <w:pgMar w:top="936" w:right="1080" w:bottom="936" w:left="1080" w:header="720" w:footer="720" w:gutter="0"/>
       <w:cols w:space="720"/>
       <w:docGrid w:linePitch="360"/>
     </w:sectPr>
   </w:body>
 </w:document>
+</file>
+
+<file path=word/footer1.xml><?xml version="1.0" encoding="utf-8"?>
+<w:ftr xmlns:m="http://schemas.openxmlformats.org/officeDocument/2006/math" xmlns:mc="http://schemas.openxmlformats.org/markup-compatibility/2006" xmlns:mo="http://schemas.microsoft.com/office/mac/office/2008/main" xmlns:mv="urn:schemas-microsoft-com:mac:vml" xmlns:o="urn:schemas-microsoft-com:office:office" xmlns:r="http://schemas.openxmlformats.org/officeDocument/2006/relationships" xmlns:v="urn:schemas-microsoft-com:vml" xmlns:w10="urn:schemas-microsoft-com:office:word" xmlns:w14="http://schemas.microsoft.com/office/word/2010/wordml" xmlns:w="http://schemas.openxmlformats.org/wordprocessingml/2006/main" xmlns:wne="http://schemas.microsoft.com/office/word/2006/wordml" xmlns:wp14="http://schemas.microsoft.com/office/word/2010/wordprocessingDrawing" xmlns:wp="http://schemas.openxmlformats.org/drawingml/2006/wordprocessingDrawing" xmlns:wpc="http://schemas.microsoft.com/office/word/2010/wordprocessingCanvas" xmlns:wpg="http://schemas.microsoft.com/office/word/2010/wordprocessingGroup" xmlns:wpi="http://schemas.microsoft.com/office/word/2010/wordprocessingInk" xmlns:wps="http://schemas.microsoft.com/office/word/2010/wordprocessingShape" mc:Ignorable="w14 wp14">
+  <w:p>
+    <w:pPr>
+      <w:pStyle w:val="Footer"/>
+    </w:pPr>
+    <w:r>
+      <w:t xml:space="preserve">GARDEN HANDBOOK   •   </w:t>
+    </w:r>
+    <w:fldSimple w:instr="PAGE">
+      <w:r>
+        <w:t>1</w:t>
+      </w:r>
+    </w:fldSimple>
+  </w:p>
+</w:ftr>
+</file>
+
+<file path=word/header1.xml><?xml version="1.0" encoding="utf-8"?>
+<w:hdr xmlns:m="http://schemas.openxmlformats.org/officeDocument/2006/math" xmlns:mc="http://schemas.openxmlformats.org/markup-compatibility/2006" xmlns:mo="http://schemas.microsoft.com/office/mac/office/2008/main" xmlns:mv="urn:schemas-microsoft-com:mac:vml" xmlns:o="urn:schemas-microsoft-com:office:office" xmlns:r="http://schemas.openxmlformats.org/officeDocument/2006/relationships" xmlns:v="urn:schemas-microsoft-com:vml" xmlns:w10="urn:schemas-microsoft-com:office:word" xmlns:w14="http://schemas.microsoft.com/office/word/2010/wordml" xmlns:w="http://schemas.openxmlformats.org/wordprocessingml/2006/main" xmlns:wne="http://schemas.microsoft.com/office/word/2006/wordml" xmlns:wp14="http://schemas.microsoft.com/office/word/2010/wordprocessingDrawing" xmlns:wp="http://schemas.openxmlformats.org/drawingml/2006/wordprocessingDrawing" xmlns:wpc="http://schemas.microsoft.com/office/word/2010/wordprocessingCanvas" xmlns:wpg="http://schemas.microsoft.com/office/word/2010/wordprocessingGroup" xmlns:wpi="http://schemas.microsoft.com/office/word/2010/wordprocessingInk" xmlns:wps="http://schemas.microsoft.com/office/word/2010/wordprocessingShape" mc:Ignorable="w14 wp14">
+  <w:p>
+    <w:pPr>
+      <w:pStyle w:val="Caption"/>
+    </w:pPr>
+    <w:r>
+      <w:t>FIELD NOTES   /   COMMUNITY GARDEN</w:t>
+    </w:r>
+  </w:p>
+</w:hdr>
 </file>
 
 <file path=word/numbering.xml><?xml version="1.0" encoding="utf-8"?>
@@ -612,11 +1073,11 @@
     <w:qFormat/>
     <w:rsid w:val="00FC693F"/>
     <w:pPr>
-      <w:spacing w:after="200"/>
+      <w:spacing w:after="160"/>
     </w:pPr>
     <w:rPr>
       <w:rFonts w:ascii="Calibri" w:hAnsi="Calibri"/>
-      <w:sz w:val="24"/>
+      <w:sz w:val="22"/>
     </w:rPr>
   </w:style>
   <w:style w:type="paragraph" w:styleId="Header">
@@ -682,7 +1143,7 @@
       <w:b/>
       <w:bCs/>
       <w:color w:val="2449DF"/>
-      <w:sz w:val="28"/>
+      <w:sz w:val="40"/>
       <w:szCs w:val="28"/>
     </w:rPr>
   </w:style>
@@ -706,7 +1167,7 @@
       <w:b/>
       <w:bCs/>
       <w:color w:val="2449DF"/>
-      <w:sz w:val="26"/>
+      <w:sz w:val="28"/>
       <w:szCs w:val="26"/>
     </w:rPr>
   </w:style>
@@ -971,7 +1432,7 @@
       <w:color w:val="2449DF"/>
       <w:spacing w:val="5"/>
       <w:kern w:val="28"/>
-      <w:sz w:val="52"/>
+      <w:sz w:val="68"/>
       <w:szCs w:val="52"/>
     </w:rPr>
   </w:style>

</xml_diff>